<commit_message>
Codebook templates: one codebook per unit of analysis, with a linking section; FAQ slide in S19 and W10
Co-Authored-By: Claude Opus 5.5 <noreply@anthropic.com>
</commit_message>
<xml_diff>
--- a/resources/templates/MC451-codebook-template.docx
+++ b/resources/templates/MC451-codebook-template.docx
@@ -7,7 +7,7 @@
         <w:pStyle w:val="Title"/>
       </w:pPr>
       <w:r>
-        <w:t xml:space="preserve">MC 451 Codebook and Qualitative Memo Template</w:t>
+        <w:t xml:space="preserve">Codebook and Qualitative Memo</w:t>
       </w:r>
     </w:p>
     <w:p>
@@ -26,7 +26,7 @@
         <w:t xml:space="preserve">How to use this template: replace every line in italics with your own writing, then delete the italics. Use it as it is, or as inspiration for your own layout. The headings follow the rubric, so each part maps to one grading row.</w:t>
       </w:r>
     </w:p>
-    <w:bookmarkStart w:id="17" w:name="part-1-codebook"/>
+    <w:bookmarkStart w:id="19" w:name="part-1-codebook"/>
     <w:p>
       <w:pPr>
         <w:pStyle w:val="Heading1"/>
@@ -79,40 +79,246 @@
       </w:r>
     </w:p>
     <w:bookmarkEnd w:id="10"/>
-    <w:bookmarkStart w:id="13" w:name="variables"/>
+    <w:bookmarkStart w:id="12" w:name="if-your-study-uses-more-than-one-source"/>
     <w:p>
       <w:pPr>
         <w:pStyle w:val="Heading2"/>
       </w:pPr>
       <w:r>
-        <w:t xml:space="preserve">Variables</w:t>
+        <w:t xml:space="preserve">If your study uses more than one source</w:t>
       </w:r>
     </w:p>
     <w:p>
       <w:pPr>
         <w:pStyle w:val="FirstParagraph"/>
       </w:pPr>
-      <w:r>
-        <w:t xml:space="preserve">Repeat the table below once per variable, as many times as your study has variables. Delete any copy you do not use.</w:t>
-      </w:r>
-    </w:p>
-    <w:bookmarkStart w:id="11" w:name="variable-1-name"/>
-    <w:p>
-      <w:pPr>
-        <w:pStyle w:val="Heading3"/>
-      </w:pPr>
-      <w:r>
-        <w:t xml:space="preserve">Variable 1:</w:t>
-      </w:r>
-      <w:r>
-        <w:t xml:space="preserve"> </w:t>
-      </w:r>
       <w:r>
         <w:rPr>
           <w:i/>
           <w:iCs/>
         </w:rPr>
-        <w:t xml:space="preserve">name</w:t>
+        <w:t xml:space="preserve">Skip this section if all your material comes from one source.</w:t>
+      </w:r>
+    </w:p>
+    <w:p>
+      <w:pPr>
+        <w:pStyle w:val="BodyText"/>
+      </w:pPr>
+      <w:r>
+        <w:t xml:space="preserve">Write one codebook for each</w:t>
+      </w:r>
+      <w:r>
+        <w:t xml:space="preserve"> </w:t>
+      </w:r>
+      <w:r>
+        <w:rPr>
+          <w:b/>
+          <w:bCs/>
+        </w:rPr>
+        <w:t xml:space="preserve">unit of analysis</w:t>
+      </w:r>
+      <w:r>
+        <w:t xml:space="preserve">, not one for each platform. Two sources that share a unit share a codebook. Two sources with different units each get their own codebook, joined by a key.</w:t>
+      </w:r>
+    </w:p>
+    <w:tbl>
+      <w:tblPr>
+        <w:tblStyle w:val="Table"/>
+        <w:tblW w:type="pct" w:w="5000"/>
+        <w:tblLayout w:type="fixed"/>
+        <w:tblLook w:firstRow="1" w:lastRow="0" w:firstColumn="0" w:lastColumn="0" w:noHBand="0" w:noVBand="0" w:val="0020"/>
+      </w:tblPr>
+      <w:tblGrid>
+        <w:gridCol w:w="2640"/>
+        <w:gridCol w:w="2640"/>
+        <w:gridCol w:w="2640"/>
+      </w:tblGrid>
+      <w:tr>
+        <w:trPr>
+          <w:tblHeader w:val="on"/>
+        </w:trPr>
+        <w:tc>
+          <w:tcPr/>
+          <w:p>
+            <w:pPr>
+              <w:pStyle w:val="Compact"/>
+              <w:jc w:val="left"/>
+            </w:pPr>
+            <w:r>
+              <w:t xml:space="preserve">Your study</w:t>
+            </w:r>
+          </w:p>
+        </w:tc>
+        <w:tc>
+          <w:tcPr/>
+          <w:p>
+            <w:pPr>
+              <w:pStyle w:val="Compact"/>
+              <w:jc w:val="left"/>
+            </w:pPr>
+            <w:r>
+              <w:t xml:space="preserve">Units</w:t>
+            </w:r>
+          </w:p>
+        </w:tc>
+        <w:tc>
+          <w:tcPr/>
+          <w:p>
+            <w:pPr>
+              <w:pStyle w:val="Compact"/>
+              <w:jc w:val="left"/>
+            </w:pPr>
+            <w:r>
+              <w:t xml:space="preserve">Codebooks</w:t>
+            </w:r>
+          </w:p>
+        </w:tc>
+      </w:tr>
+      <w:tr>
+        <w:tc>
+          <w:tcPr/>
+          <w:p>
+            <w:pPr>
+              <w:pStyle w:val="Compact"/>
+              <w:jc w:val="left"/>
+            </w:pPr>
+            <w:r>
+              <w:t xml:space="preserve">Spotify streaming numbers and TikTok videos that use the same songs</w:t>
+            </w:r>
+          </w:p>
+        </w:tc>
+        <w:tc>
+          <w:tcPr/>
+          <w:p>
+            <w:pPr>
+              <w:pStyle w:val="Compact"/>
+              <w:jc w:val="left"/>
+            </w:pPr>
+            <w:r>
+              <w:t xml:space="preserve">A song (Spotify) and a video (TikTok)</w:t>
+            </w:r>
+          </w:p>
+        </w:tc>
+        <w:tc>
+          <w:tcPr/>
+          <w:p>
+            <w:pPr>
+              <w:pStyle w:val="Compact"/>
+              <w:jc w:val="left"/>
+            </w:pPr>
+            <w:r>
+              <w:t xml:space="preserve">Two, linked by the song</w:t>
+            </w:r>
+          </w:p>
+        </w:tc>
+      </w:tr>
+      <w:tr>
+        <w:tc>
+          <w:tcPr/>
+          <w:p>
+            <w:pPr>
+              <w:pStyle w:val="Compact"/>
+              <w:jc w:val="left"/>
+            </w:pPr>
+            <w:r>
+              <w:t xml:space="preserve">Box office figures and published reviews of the same films</w:t>
+            </w:r>
+          </w:p>
+        </w:tc>
+        <w:tc>
+          <w:tcPr/>
+          <w:p>
+            <w:pPr>
+              <w:pStyle w:val="Compact"/>
+              <w:jc w:val="left"/>
+            </w:pPr>
+            <w:r>
+              <w:t xml:space="preserve">A film (box office) and a review (reviews)</w:t>
+            </w:r>
+          </w:p>
+        </w:tc>
+        <w:tc>
+          <w:tcPr/>
+          <w:p>
+            <w:pPr>
+              <w:pStyle w:val="Compact"/>
+              <w:jc w:val="left"/>
+            </w:pPr>
+            <w:r>
+              <w:t xml:space="preserve">Two, linked by the film</w:t>
+            </w:r>
+          </w:p>
+        </w:tc>
+      </w:tr>
+      <w:tr>
+        <w:tc>
+          <w:tcPr/>
+          <w:p>
+            <w:pPr>
+              <w:pStyle w:val="Compact"/>
+              <w:jc w:val="left"/>
+            </w:pPr>
+            <w:r>
+              <w:t xml:space="preserve">TikTok videos and Instagram Reels on the same topic, coded the same way</w:t>
+            </w:r>
+          </w:p>
+        </w:tc>
+        <w:tc>
+          <w:tcPr/>
+          <w:p>
+            <w:pPr>
+              <w:pStyle w:val="Compact"/>
+              <w:jc w:val="left"/>
+            </w:pPr>
+            <w:r>
+              <w:t xml:space="preserve">A short video, on both platforms</w:t>
+            </w:r>
+          </w:p>
+        </w:tc>
+        <w:tc>
+          <w:tcPr/>
+          <w:p>
+            <w:pPr>
+              <w:pStyle w:val="Compact"/>
+              <w:jc w:val="left"/>
+            </w:pPr>
+            <w:r>
+              <w:t xml:space="preserve">One, with a</w:t>
+            </w:r>
+            <w:r>
+              <w:t xml:space="preserve"> </w:t>
+            </w:r>
+            <w:r>
+              <w:rPr>
+                <w:rStyle w:val="VerbatimChar"/>
+              </w:rPr>
+              <w:t xml:space="preserve">platform</w:t>
+            </w:r>
+            <w:r>
+              <w:t xml:space="preserve"> </w:t>
+            </w:r>
+            <w:r>
+              <w:t xml:space="preserve">variable</w:t>
+            </w:r>
+          </w:p>
+        </w:tc>
+      </w:tr>
+    </w:tbl>
+    <w:p>
+      <w:pPr>
+        <w:pStyle w:val="BodyText"/>
+      </w:pPr>
+      <w:r>
+        <w:t xml:space="preserve">When you need two codebooks, repeat Part 1 for each one, then add a linking section:</w:t>
+      </w:r>
+    </w:p>
+    <w:bookmarkStart w:id="11" w:name="linking-the-codebooks"/>
+    <w:p>
+      <w:pPr>
+        <w:pStyle w:val="Heading3"/>
+      </w:pPr>
+      <w:r>
+        <w:t xml:space="preserve">Linking the codebooks</w:t>
       </w:r>
     </w:p>
     <w:tbl>
@@ -164,23 +370,74 @@
               <w:jc w:val="left"/>
             </w:pPr>
             <w:r>
-              <w:t xml:space="preserve">Conceptual definition and source</w:t>
-            </w:r>
-          </w:p>
-        </w:tc>
-        <w:tc>
-          <w:tcPr/>
-          <w:p>
-            <w:pPr>
-              <w:pStyle w:val="Compact"/>
-              <w:jc w:val="left"/>
-            </w:pPr>
-            <w:r>
-              <w:rPr>
-                <w:i/>
-                <w:iCs/>
-              </w:rPr>
-              <w:t xml:space="preserve">What the concept means, in a sentence or two, with the source you took it from (author, year).</w:t>
+              <w:t xml:space="preserve">Key variable</w:t>
+            </w:r>
+          </w:p>
+        </w:tc>
+        <w:tc>
+          <w:tcPr/>
+          <w:p>
+            <w:pPr>
+              <w:pStyle w:val="Compact"/>
+              <w:jc w:val="left"/>
+            </w:pPr>
+            <w:r>
+              <w:rPr>
+                <w:i/>
+                <w:iCs/>
+              </w:rPr>
+              <w:t xml:space="preserve">The variable that appears in both codebooks and names the same thing in each (for example,</w:t>
+            </w:r>
+            <w:r>
+              <w:rPr>
+                <w:i/>
+                <w:iCs/>
+              </w:rPr>
+              <w:t xml:space="preserve"> </w:t>
+            </w:r>
+            <w:r>
+              <w:rPr>
+                <w:rStyle w:val="VerbatimChar"/>
+                <w:i/>
+                <w:iCs/>
+              </w:rPr>
+              <w:t xml:space="preserve">song_id</w:t>
+            </w:r>
+            <w:r>
+              <w:rPr>
+                <w:i/>
+                <w:iCs/>
+              </w:rPr>
+              <w:t xml:space="preserve"> </w:t>
+            </w:r>
+            <w:r>
+              <w:rPr>
+                <w:i/>
+                <w:iCs/>
+              </w:rPr>
+              <w:t xml:space="preserve">or</w:t>
+            </w:r>
+            <w:r>
+              <w:rPr>
+                <w:i/>
+                <w:iCs/>
+              </w:rPr>
+              <w:t xml:space="preserve"> </w:t>
+            </w:r>
+            <w:r>
+              <w:rPr>
+                <w:rStyle w:val="VerbatimChar"/>
+                <w:i/>
+                <w:iCs/>
+              </w:rPr>
+              <w:t xml:space="preserve">film_title</w:t>
+            </w:r>
+            <w:r>
+              <w:rPr>
+                <w:i/>
+                <w:iCs/>
+              </w:rPr>
+              <w:t xml:space="preserve">). Define it in both codebooks, word for word.</w:t>
             </w:r>
           </w:p>
         </w:tc>
@@ -194,23 +451,44 @@
               <w:jc w:val="left"/>
             </w:pPr>
             <w:r>
-              <w:t xml:space="preserve">Operational definition</w:t>
-            </w:r>
-          </w:p>
-        </w:tc>
-        <w:tc>
-          <w:tcPr/>
-          <w:p>
-            <w:pPr>
-              <w:pStyle w:val="Compact"/>
-              <w:jc w:val="left"/>
-            </w:pPr>
-            <w:r>
-              <w:rPr>
-                <w:i/>
-                <w:iCs/>
-              </w:rPr>
-              <w:t xml:space="preserve">What the coder does: what to read, what to look for, and which value to mark. Write it as steps a stranger could follow.</w:t>
+              <w:t xml:space="preserve">How records match</w:t>
+            </w:r>
+          </w:p>
+        </w:tc>
+        <w:tc>
+          <w:tcPr/>
+          <w:p>
+            <w:pPr>
+              <w:pStyle w:val="Compact"/>
+              <w:jc w:val="left"/>
+            </w:pPr>
+            <w:r>
+              <w:rPr>
+                <w:i/>
+                <w:iCs/>
+              </w:rPr>
+              <w:t xml:space="preserve">Write the matching rule: spelling, capitalization, and how you treat remixes, re-releases, or two films with the same title. Write it as a rule:</w:t>
+            </w:r>
+            <w:r>
+              <w:rPr>
+                <w:i/>
+                <w:iCs/>
+              </w:rPr>
+              <w:t xml:space="preserve"> </w:t>
+            </w:r>
+            <w:r>
+              <w:rPr>
+                <w:i/>
+                <w:iCs/>
+              </w:rPr>
+              <w:t xml:space="preserve">“If …, match …”</w:t>
+            </w:r>
+            <w:r>
+              <w:rPr>
+                <w:i/>
+                <w:iCs/>
+              </w:rPr>
+              <w:t xml:space="preserve">.</w:t>
             </w:r>
           </w:p>
         </w:tc>
@@ -224,23 +502,23 @@
               <w:jc w:val="left"/>
             </w:pPr>
             <w:r>
-              <w:t xml:space="preserve">Level of measurement, and what it allows</w:t>
-            </w:r>
-          </w:p>
-        </w:tc>
-        <w:tc>
-          <w:tcPr/>
-          <w:p>
-            <w:pPr>
-              <w:pStyle w:val="Compact"/>
-              <w:jc w:val="left"/>
-            </w:pPr>
-            <w:r>
-              <w:rPr>
-                <w:i/>
-                <w:iCs/>
-              </w:rPr>
-              <w:t xml:space="preserve">Nominal, ordinal, interval, or ratio. One sentence on what it allows (counts, a median, a mean) and one on what it rules out.</w:t>
+              <w:t xml:space="preserve">How many to how many</w:t>
+            </w:r>
+          </w:p>
+        </w:tc>
+        <w:tc>
+          <w:tcPr/>
+          <w:p>
+            <w:pPr>
+              <w:pStyle w:val="Compact"/>
+              <w:jc w:val="left"/>
+            </w:pPr>
+            <w:r>
+              <w:rPr>
+                <w:i/>
+                <w:iCs/>
+              </w:rPr>
+              <w:t xml:space="preserve">How many items in one codebook match one item in the other (one song to many TikTok videos; one film to many reviews).</w:t>
             </w:r>
           </w:p>
         </w:tc>
@@ -254,87 +532,62 @@
               <w:jc w:val="left"/>
             </w:pPr>
             <w:r>
-              <w:t xml:space="preserve">Coded values</w:t>
-            </w:r>
-          </w:p>
-        </w:tc>
-        <w:tc>
-          <w:tcPr/>
-          <w:p>
-            <w:pPr>
-              <w:pStyle w:val="Compact"/>
-              <w:jc w:val="left"/>
-            </w:pPr>
-            <w:r>
-              <w:rPr>
-                <w:i/>
-                <w:iCs/>
-              </w:rPr>
-              <w:t xml:space="preserve">Each value with its meaning (0 = …, 1 = …). Include an other value or a none value so every item has somewhere to go.</w:t>
-            </w:r>
-          </w:p>
-        </w:tc>
-      </w:tr>
-      <w:tr>
-        <w:tc>
-          <w:tcPr/>
-          <w:p>
-            <w:pPr>
-              <w:pStyle w:val="Compact"/>
-              <w:jc w:val="left"/>
-            </w:pPr>
-            <w:r>
-              <w:t xml:space="preserve">Edge-case decision rules</w:t>
-            </w:r>
-          </w:p>
-        </w:tc>
-        <w:tc>
-          <w:tcPr/>
-          <w:p>
-            <w:pPr>
-              <w:pStyle w:val="Compact"/>
-              <w:jc w:val="left"/>
-            </w:pPr>
-            <w:r>
-              <w:rPr>
-                <w:i/>
-                <w:iCs/>
-              </w:rPr>
-              <w:t xml:space="preserve">At least two rules for this variable, each written as a rule:</w:t>
-            </w:r>
-            <w:r>
-              <w:rPr>
-                <w:i/>
-                <w:iCs/>
-              </w:rPr>
-              <w:t xml:space="preserve"> </w:t>
-            </w:r>
-            <w:r>
-              <w:rPr>
-                <w:i/>
-                <w:iCs/>
-              </w:rPr>
-              <w:t xml:space="preserve">“If …, code …”</w:t>
-            </w:r>
-            <w:r>
-              <w:rPr>
-                <w:i/>
-                <w:iCs/>
-              </w:rPr>
-              <w:t xml:space="preserve">.</w:t>
+              <w:t xml:space="preserve">Records that do not match</w:t>
+            </w:r>
+          </w:p>
+        </w:tc>
+        <w:tc>
+          <w:tcPr/>
+          <w:p>
+            <w:pPr>
+              <w:pStyle w:val="Compact"/>
+              <w:jc w:val="left"/>
+            </w:pPr>
+            <w:r>
+              <w:rPr>
+                <w:i/>
+                <w:iCs/>
+              </w:rPr>
+              <w:t xml:space="preserve">What you do with an item that has no partner in the other source: keep it, drop it, or code it separately. Say which and why.</w:t>
             </w:r>
           </w:p>
         </w:tc>
       </w:tr>
     </w:tbl>
+    <w:p>
+      <w:pPr>
+        <w:pStyle w:val="BodyText"/>
+      </w:pPr>
+      <w:r>
+        <w:t xml:space="preserve">The key is what lets you put the two sources side by side in R later: one table per codebook, joined on the key.</w:t>
+      </w:r>
+    </w:p>
     <w:bookmarkEnd w:id="11"/>
-    <w:bookmarkStart w:id="12" w:name="variable-2-name"/>
+    <w:bookmarkEnd w:id="12"/>
+    <w:bookmarkStart w:id="15" w:name="variables"/>
+    <w:p>
+      <w:pPr>
+        <w:pStyle w:val="Heading2"/>
+      </w:pPr>
+      <w:r>
+        <w:t xml:space="preserve">Variables</w:t>
+      </w:r>
+    </w:p>
+    <w:p>
+      <w:pPr>
+        <w:pStyle w:val="FirstParagraph"/>
+      </w:pPr>
+      <w:r>
+        <w:t xml:space="preserve">Repeat the table below once per variable, as many times as your study has variables. Delete any copy you do not use.</w:t>
+      </w:r>
+    </w:p>
+    <w:bookmarkStart w:id="13" w:name="variable-1-name"/>
     <w:p>
       <w:pPr>
         <w:pStyle w:val="Heading3"/>
       </w:pPr>
       <w:r>
-        <w:t xml:space="preserve">Variable 2:</w:t>
+        <w:t xml:space="preserve">Variable 1:</w:t>
       </w:r>
       <w:r>
         <w:t xml:space="preserve"> </w:t>
@@ -412,7 +665,7 @@
                 <w:i/>
                 <w:iCs/>
               </w:rPr>
-              <w:t xml:space="preserve">Definition, with its source.</w:t>
+              <w:t xml:space="preserve">What the concept means, in a sentence or two, with the source you took it from (author, year).</w:t>
             </w:r>
           </w:p>
         </w:tc>
@@ -442,7 +695,7 @@
                 <w:i/>
                 <w:iCs/>
               </w:rPr>
-              <w:t xml:space="preserve">Coder actions, as steps.</w:t>
+              <w:t xml:space="preserve">What the coder does: what to read, what to look for, and which value to mark. Write it as steps a stranger could follow.</w:t>
             </w:r>
           </w:p>
         </w:tc>
@@ -472,7 +725,7 @@
                 <w:i/>
                 <w:iCs/>
               </w:rPr>
-              <w:t xml:space="preserve">Level, what it allows, and what it rules out.</w:t>
+              <w:t xml:space="preserve">Nominal, ordinal, interval, or ratio. One sentence on what it allows (counts, a median, a mean) and one on what it rules out.</w:t>
             </w:r>
           </w:p>
         </w:tc>
@@ -502,7 +755,7 @@
                 <w:i/>
                 <w:iCs/>
               </w:rPr>
-              <w:t xml:space="preserve">Each value with its meaning, including other or none.</w:t>
+              <w:t xml:space="preserve">Each value with its meaning (0 = …, 1 = …). Include an other value or a none value so every item has somewhere to go.</w:t>
             </w:r>
           </w:p>
         </w:tc>
@@ -532,7 +785,7 @@
                 <w:i/>
                 <w:iCs/>
               </w:rPr>
-              <w:t xml:space="preserve">At least two rules:</w:t>
+              <w:t xml:space="preserve">At least two rules for this variable, each written as a rule:</w:t>
             </w:r>
             <w:r>
               <w:rPr>
@@ -559,9 +812,241 @@
         </w:tc>
       </w:tr>
     </w:tbl>
-    <w:bookmarkEnd w:id="12"/>
     <w:bookmarkEnd w:id="13"/>
-    <w:bookmarkStart w:id="14" w:name="decision-rules-for-the-whole-codebook"/>
+    <w:bookmarkStart w:id="14" w:name="variable-2-name"/>
+    <w:p>
+      <w:pPr>
+        <w:pStyle w:val="Heading3"/>
+      </w:pPr>
+      <w:r>
+        <w:t xml:space="preserve">Variable 2:</w:t>
+      </w:r>
+      <w:r>
+        <w:t xml:space="preserve"> </w:t>
+      </w:r>
+      <w:r>
+        <w:rPr>
+          <w:i/>
+          <w:iCs/>
+        </w:rPr>
+        <w:t xml:space="preserve">name</w:t>
+      </w:r>
+    </w:p>
+    <w:tbl>
+      <w:tblPr>
+        <w:tblStyle w:val="Table"/>
+        <w:tblW w:type="pct" w:w="5000"/>
+        <w:tblLayout w:type="fixed"/>
+        <w:tblLook w:firstRow="1" w:lastRow="0" w:firstColumn="0" w:lastColumn="0" w:noHBand="0" w:noVBand="0" w:val="0020"/>
+      </w:tblPr>
+      <w:tblGrid>
+        <w:gridCol w:w="3960"/>
+        <w:gridCol w:w="3960"/>
+      </w:tblGrid>
+      <w:tr>
+        <w:trPr>
+          <w:tblHeader w:val="on"/>
+        </w:trPr>
+        <w:tc>
+          <w:tcPr/>
+          <w:p>
+            <w:pPr>
+              <w:pStyle w:val="Compact"/>
+              <w:jc w:val="left"/>
+            </w:pPr>
+            <w:r>
+              <w:t xml:space="preserve">Element</w:t>
+            </w:r>
+          </w:p>
+        </w:tc>
+        <w:tc>
+          <w:tcPr/>
+          <w:p>
+            <w:pPr>
+              <w:pStyle w:val="Compact"/>
+              <w:jc w:val="left"/>
+            </w:pPr>
+            <w:r>
+              <w:t xml:space="preserve">Your entry</w:t>
+            </w:r>
+          </w:p>
+        </w:tc>
+      </w:tr>
+      <w:tr>
+        <w:tc>
+          <w:tcPr/>
+          <w:p>
+            <w:pPr>
+              <w:pStyle w:val="Compact"/>
+              <w:jc w:val="left"/>
+            </w:pPr>
+            <w:r>
+              <w:t xml:space="preserve">Conceptual definition and source</w:t>
+            </w:r>
+          </w:p>
+        </w:tc>
+        <w:tc>
+          <w:tcPr/>
+          <w:p>
+            <w:pPr>
+              <w:pStyle w:val="Compact"/>
+              <w:jc w:val="left"/>
+            </w:pPr>
+            <w:r>
+              <w:rPr>
+                <w:i/>
+                <w:iCs/>
+              </w:rPr>
+              <w:t xml:space="preserve">Definition, with its source.</w:t>
+            </w:r>
+          </w:p>
+        </w:tc>
+      </w:tr>
+      <w:tr>
+        <w:tc>
+          <w:tcPr/>
+          <w:p>
+            <w:pPr>
+              <w:pStyle w:val="Compact"/>
+              <w:jc w:val="left"/>
+            </w:pPr>
+            <w:r>
+              <w:t xml:space="preserve">Operational definition</w:t>
+            </w:r>
+          </w:p>
+        </w:tc>
+        <w:tc>
+          <w:tcPr/>
+          <w:p>
+            <w:pPr>
+              <w:pStyle w:val="Compact"/>
+              <w:jc w:val="left"/>
+            </w:pPr>
+            <w:r>
+              <w:rPr>
+                <w:i/>
+                <w:iCs/>
+              </w:rPr>
+              <w:t xml:space="preserve">Coder actions, as steps.</w:t>
+            </w:r>
+          </w:p>
+        </w:tc>
+      </w:tr>
+      <w:tr>
+        <w:tc>
+          <w:tcPr/>
+          <w:p>
+            <w:pPr>
+              <w:pStyle w:val="Compact"/>
+              <w:jc w:val="left"/>
+            </w:pPr>
+            <w:r>
+              <w:t xml:space="preserve">Level of measurement, and what it allows</w:t>
+            </w:r>
+          </w:p>
+        </w:tc>
+        <w:tc>
+          <w:tcPr/>
+          <w:p>
+            <w:pPr>
+              <w:pStyle w:val="Compact"/>
+              <w:jc w:val="left"/>
+            </w:pPr>
+            <w:r>
+              <w:rPr>
+                <w:i/>
+                <w:iCs/>
+              </w:rPr>
+              <w:t xml:space="preserve">Level, what it allows, and what it rules out.</w:t>
+            </w:r>
+          </w:p>
+        </w:tc>
+      </w:tr>
+      <w:tr>
+        <w:tc>
+          <w:tcPr/>
+          <w:p>
+            <w:pPr>
+              <w:pStyle w:val="Compact"/>
+              <w:jc w:val="left"/>
+            </w:pPr>
+            <w:r>
+              <w:t xml:space="preserve">Coded values</w:t>
+            </w:r>
+          </w:p>
+        </w:tc>
+        <w:tc>
+          <w:tcPr/>
+          <w:p>
+            <w:pPr>
+              <w:pStyle w:val="Compact"/>
+              <w:jc w:val="left"/>
+            </w:pPr>
+            <w:r>
+              <w:rPr>
+                <w:i/>
+                <w:iCs/>
+              </w:rPr>
+              <w:t xml:space="preserve">Each value with its meaning, including other or none.</w:t>
+            </w:r>
+          </w:p>
+        </w:tc>
+      </w:tr>
+      <w:tr>
+        <w:tc>
+          <w:tcPr/>
+          <w:p>
+            <w:pPr>
+              <w:pStyle w:val="Compact"/>
+              <w:jc w:val="left"/>
+            </w:pPr>
+            <w:r>
+              <w:t xml:space="preserve">Edge-case decision rules</w:t>
+            </w:r>
+          </w:p>
+        </w:tc>
+        <w:tc>
+          <w:tcPr/>
+          <w:p>
+            <w:pPr>
+              <w:pStyle w:val="Compact"/>
+              <w:jc w:val="left"/>
+            </w:pPr>
+            <w:r>
+              <w:rPr>
+                <w:i/>
+                <w:iCs/>
+              </w:rPr>
+              <w:t xml:space="preserve">At least two rules:</w:t>
+            </w:r>
+            <w:r>
+              <w:rPr>
+                <w:i/>
+                <w:iCs/>
+              </w:rPr>
+              <w:t xml:space="preserve"> </w:t>
+            </w:r>
+            <w:r>
+              <w:rPr>
+                <w:i/>
+                <w:iCs/>
+              </w:rPr>
+              <w:t xml:space="preserve">“If …, code …”</w:t>
+            </w:r>
+            <w:r>
+              <w:rPr>
+                <w:i/>
+                <w:iCs/>
+              </w:rPr>
+              <w:t xml:space="preserve">.</w:t>
+            </w:r>
+          </w:p>
+        </w:tc>
+      </w:tr>
+    </w:tbl>
+    <w:bookmarkEnd w:id="14"/>
+    <w:bookmarkEnd w:id="15"/>
+    <w:bookmarkStart w:id="16" w:name="decision-rules-for-the-whole-codebook"/>
     <w:p>
       <w:pPr>
         <w:pStyle w:val="Heading2"/>
@@ -630,8 +1115,8 @@
         <w:t xml:space="preserve">If …, code …</w:t>
       </w:r>
     </w:p>
-    <w:bookmarkEnd w:id="14"/>
-    <w:bookmarkStart w:id="15" w:name="examples"/>
+    <w:bookmarkEnd w:id="16"/>
+    <w:bookmarkStart w:id="17" w:name="examples"/>
     <w:p>
       <w:pPr>
         <w:pStyle w:val="Heading2"/>
@@ -794,8 +1279,8 @@
         </w:tc>
       </w:tr>
     </w:tbl>
-    <w:bookmarkEnd w:id="15"/>
-    <w:bookmarkStart w:id="16" w:name="single-coder-note"/>
+    <w:bookmarkEnd w:id="17"/>
+    <w:bookmarkStart w:id="18" w:name="single-coder-note"/>
     <w:p>
       <w:pPr>
         <w:pStyle w:val="Heading2"/>
@@ -840,9 +1325,9 @@
         <w:t xml:space="preserve">Paragraph 3: the second-coder counterfactual, written as what you would do if this study had a second coder: how many items you would double-code, what number you would report, how you would train the coder and settle disagreements, and which finding is most at risk.</w:t>
       </w:r>
     </w:p>
-    <w:bookmarkEnd w:id="16"/>
-    <w:bookmarkEnd w:id="17"/>
-    <w:bookmarkStart w:id="19" w:name="part-2-qualitative-memo"/>
+    <w:bookmarkEnd w:id="18"/>
+    <w:bookmarkEnd w:id="19"/>
+    <w:bookmarkStart w:id="21" w:name="part-2-qualitative-memo"/>
     <w:p>
       <w:pPr>
         <w:pStyle w:val="Heading1"/>
@@ -863,7 +1348,7 @@
         <w:t xml:space="preserve">200 to 300 words on the patterns you saw while reading or watching your material. Describe what you saw, not the topic in general. Name the pattern behind each codebook category, so every category traces back to something here.</w:t>
       </w:r>
     </w:p>
-    <w:bookmarkStart w:id="18" w:name="references"/>
+    <w:bookmarkStart w:id="20" w:name="references"/>
     <w:p>
       <w:pPr>
         <w:pStyle w:val="Heading2"/>
@@ -884,8 +1369,8 @@
         <w:t xml:space="preserve">Every source cited above, in APA 7.</w:t>
       </w:r>
     </w:p>
-    <w:bookmarkEnd w:id="18"/>
-    <w:bookmarkEnd w:id="19"/>
+    <w:bookmarkEnd w:id="20"/>
+    <w:bookmarkEnd w:id="21"/>
     <w:sectPr>
       <w:footnotePr>
         <w:numRestart w:val="eachSect"/>
@@ -1800,7 +2285,7 @@
       <w:color w:themeColor="accent1" w:themeShade="BF" w:val="365F91"/>
     </w:rPr>
   </w:style>
-  <w:style w:type="paragraph" w:customStyle="1" w:styleId="SourceCode">
+  <w:style w:customStyle="1" w:styleId="SourceCode" w:type="paragraph">
     <w:name w:val="Source Code"/>
     <w:basedOn w:val="Normal"/>
     <w:link w:val="VerbatimChar"/>
@@ -1808,7 +2293,7 @@
       <w:wordWrap w:val="off"/>
     </w:pPr>
   </w:style>
-  <w:style w:type="character" w:customStyle="1" w:styleId="KeywordTok">
+  <w:style w:customStyle="1" w:styleId="KeywordTok" w:type="character">
     <w:name w:val="KeywordTok"/>
     <w:basedOn w:val="VerbatimChar"/>
     <w:rPr>
@@ -1816,77 +2301,77 @@
       <w:color w:val="007020"/>
     </w:rPr>
   </w:style>
-  <w:style w:type="character" w:customStyle="1" w:styleId="DataTypeTok">
+  <w:style w:customStyle="1" w:styleId="DataTypeTok" w:type="character">
     <w:name w:val="DataTypeTok"/>
     <w:basedOn w:val="VerbatimChar"/>
     <w:rPr>
       <w:color w:val="902000"/>
     </w:rPr>
   </w:style>
-  <w:style w:type="character" w:customStyle="1" w:styleId="DecValTok">
+  <w:style w:customStyle="1" w:styleId="DecValTok" w:type="character">
     <w:name w:val="DecValTok"/>
     <w:basedOn w:val="VerbatimChar"/>
     <w:rPr>
       <w:color w:val="40a070"/>
     </w:rPr>
   </w:style>
-  <w:style w:type="character" w:customStyle="1" w:styleId="BaseNTok">
+  <w:style w:customStyle="1" w:styleId="BaseNTok" w:type="character">
     <w:name w:val="BaseNTok"/>
     <w:basedOn w:val="VerbatimChar"/>
     <w:rPr>
       <w:color w:val="40a070"/>
     </w:rPr>
   </w:style>
-  <w:style w:type="character" w:customStyle="1" w:styleId="FloatTok">
+  <w:style w:customStyle="1" w:styleId="FloatTok" w:type="character">
     <w:name w:val="FloatTok"/>
     <w:basedOn w:val="VerbatimChar"/>
     <w:rPr>
       <w:color w:val="40a070"/>
     </w:rPr>
   </w:style>
-  <w:style w:type="character" w:customStyle="1" w:styleId="ConstantTok">
+  <w:style w:customStyle="1" w:styleId="ConstantTok" w:type="character">
     <w:name w:val="ConstantTok"/>
     <w:basedOn w:val="VerbatimChar"/>
     <w:rPr>
       <w:color w:val="880000"/>
     </w:rPr>
   </w:style>
-  <w:style w:type="character" w:customStyle="1" w:styleId="CharTok">
+  <w:style w:customStyle="1" w:styleId="CharTok" w:type="character">
     <w:name w:val="CharTok"/>
     <w:basedOn w:val="VerbatimChar"/>
     <w:rPr>
       <w:color w:val="4070a0"/>
     </w:rPr>
   </w:style>
-  <w:style w:type="character" w:customStyle="1" w:styleId="SpecialCharTok">
+  <w:style w:customStyle="1" w:styleId="SpecialCharTok" w:type="character">
     <w:name w:val="SpecialCharTok"/>
     <w:basedOn w:val="VerbatimChar"/>
     <w:rPr>
       <w:color w:val="4070a0"/>
     </w:rPr>
   </w:style>
-  <w:style w:type="character" w:customStyle="1" w:styleId="StringTok">
+  <w:style w:customStyle="1" w:styleId="StringTok" w:type="character">
     <w:name w:val="StringTok"/>
     <w:basedOn w:val="VerbatimChar"/>
     <w:rPr>
       <w:color w:val="4070a0"/>
     </w:rPr>
   </w:style>
-  <w:style w:type="character" w:customStyle="1" w:styleId="VerbatimStringTok">
+  <w:style w:customStyle="1" w:styleId="VerbatimStringTok" w:type="character">
     <w:name w:val="VerbatimStringTok"/>
     <w:basedOn w:val="VerbatimChar"/>
     <w:rPr>
       <w:color w:val="4070a0"/>
     </w:rPr>
   </w:style>
-  <w:style w:type="character" w:customStyle="1" w:styleId="SpecialStringTok">
+  <w:style w:customStyle="1" w:styleId="SpecialStringTok" w:type="character">
     <w:name w:val="SpecialStringTok"/>
     <w:basedOn w:val="VerbatimChar"/>
     <w:rPr>
       <w:color w:val="bb6688"/>
     </w:rPr>
   </w:style>
-  <w:style w:type="character" w:customStyle="1" w:styleId="ImportTok">
+  <w:style w:customStyle="1" w:styleId="ImportTok" w:type="character">
     <w:name w:val="ImportTok"/>
     <w:basedOn w:val="VerbatimChar"/>
     <w:rPr>
@@ -1894,7 +2379,7 @@
       <w:color w:val="008000"/>
     </w:rPr>
   </w:style>
-  <w:style w:type="character" w:customStyle="1" w:styleId="CommentTok">
+  <w:style w:customStyle="1" w:styleId="CommentTok" w:type="character">
     <w:name w:val="CommentTok"/>
     <w:basedOn w:val="VerbatimChar"/>
     <w:rPr>
@@ -1902,7 +2387,7 @@
       <w:color w:val="60a0b0"/>
     </w:rPr>
   </w:style>
-  <w:style w:type="character" w:customStyle="1" w:styleId="DocumentationTok">
+  <w:style w:customStyle="1" w:styleId="DocumentationTok" w:type="character">
     <w:name w:val="DocumentationTok"/>
     <w:basedOn w:val="VerbatimChar"/>
     <w:rPr>
@@ -1910,7 +2395,7 @@
       <w:color w:val="ba2121"/>
     </w:rPr>
   </w:style>
-  <w:style w:type="character" w:customStyle="1" w:styleId="AnnotationTok">
+  <w:style w:customStyle="1" w:styleId="AnnotationTok" w:type="character">
     <w:name w:val="AnnotationTok"/>
     <w:basedOn w:val="VerbatimChar"/>
     <w:rPr>
@@ -1919,7 +2404,7 @@
       <w:color w:val="60a0b0"/>
     </w:rPr>
   </w:style>
-  <w:style w:type="character" w:customStyle="1" w:styleId="CommentVarTok">
+  <w:style w:customStyle="1" w:styleId="CommentVarTok" w:type="character">
     <w:name w:val="CommentVarTok"/>
     <w:basedOn w:val="VerbatimChar"/>
     <w:rPr>
@@ -1928,28 +2413,28 @@
       <w:color w:val="60a0b0"/>
     </w:rPr>
   </w:style>
-  <w:style w:type="character" w:customStyle="1" w:styleId="OtherTok">
+  <w:style w:customStyle="1" w:styleId="OtherTok" w:type="character">
     <w:name w:val="OtherTok"/>
     <w:basedOn w:val="VerbatimChar"/>
     <w:rPr>
       <w:color w:val="007020"/>
     </w:rPr>
   </w:style>
-  <w:style w:type="character" w:customStyle="1" w:styleId="FunctionTok">
+  <w:style w:customStyle="1" w:styleId="FunctionTok" w:type="character">
     <w:name w:val="FunctionTok"/>
     <w:basedOn w:val="VerbatimChar"/>
     <w:rPr>
       <w:color w:val="06287e"/>
     </w:rPr>
   </w:style>
-  <w:style w:type="character" w:customStyle="1" w:styleId="VariableTok">
+  <w:style w:customStyle="1" w:styleId="VariableTok" w:type="character">
     <w:name w:val="VariableTok"/>
     <w:basedOn w:val="VerbatimChar"/>
     <w:rPr>
       <w:color w:val="19177c"/>
     </w:rPr>
   </w:style>
-  <w:style w:type="character" w:customStyle="1" w:styleId="ControlFlowTok">
+  <w:style w:customStyle="1" w:styleId="ControlFlowTok" w:type="character">
     <w:name w:val="ControlFlowTok"/>
     <w:basedOn w:val="VerbatimChar"/>
     <w:rPr>
@@ -1957,45 +2442,45 @@
       <w:color w:val="007020"/>
     </w:rPr>
   </w:style>
-  <w:style w:type="character" w:customStyle="1" w:styleId="OperatorTok">
+  <w:style w:customStyle="1" w:styleId="OperatorTok" w:type="character">
     <w:name w:val="OperatorTok"/>
     <w:basedOn w:val="VerbatimChar"/>
     <w:rPr>
       <w:color w:val="666666"/>
     </w:rPr>
   </w:style>
-  <w:style w:type="character" w:customStyle="1" w:styleId="BuiltInTok">
+  <w:style w:customStyle="1" w:styleId="BuiltInTok" w:type="character">
     <w:name w:val="BuiltInTok"/>
     <w:basedOn w:val="VerbatimChar"/>
     <w:rPr>
       <w:color w:val="008000"/>
     </w:rPr>
   </w:style>
-  <w:style w:type="character" w:customStyle="1" w:styleId="ExtensionTok">
+  <w:style w:customStyle="1" w:styleId="ExtensionTok" w:type="character">
     <w:name w:val="ExtensionTok"/>
     <w:basedOn w:val="VerbatimChar"/>
     <w:rPr/>
   </w:style>
-  <w:style w:type="character" w:customStyle="1" w:styleId="PreprocessorTok">
+  <w:style w:customStyle="1" w:styleId="PreprocessorTok" w:type="character">
     <w:name w:val="PreprocessorTok"/>
     <w:basedOn w:val="VerbatimChar"/>
     <w:rPr>
       <w:color w:val="bc7a00"/>
     </w:rPr>
   </w:style>
-  <w:style w:type="character" w:customStyle="1" w:styleId="AttributeTok">
+  <w:style w:customStyle="1" w:styleId="AttributeTok" w:type="character">
     <w:name w:val="AttributeTok"/>
     <w:basedOn w:val="VerbatimChar"/>
     <w:rPr>
       <w:color w:val="7d9029"/>
     </w:rPr>
   </w:style>
-  <w:style w:type="character" w:customStyle="1" w:styleId="RegionMarkerTok">
+  <w:style w:customStyle="1" w:styleId="RegionMarkerTok" w:type="character">
     <w:name w:val="RegionMarkerTok"/>
     <w:basedOn w:val="VerbatimChar"/>
     <w:rPr/>
   </w:style>
-  <w:style w:type="character" w:customStyle="1" w:styleId="InformationTok">
+  <w:style w:customStyle="1" w:styleId="InformationTok" w:type="character">
     <w:name w:val="InformationTok"/>
     <w:basedOn w:val="VerbatimChar"/>
     <w:rPr>
@@ -2004,7 +2489,7 @@
       <w:color w:val="60a0b0"/>
     </w:rPr>
   </w:style>
-  <w:style w:type="character" w:customStyle="1" w:styleId="WarningTok">
+  <w:style w:customStyle="1" w:styleId="WarningTok" w:type="character">
     <w:name w:val="WarningTok"/>
     <w:basedOn w:val="VerbatimChar"/>
     <w:rPr>
@@ -2013,7 +2498,7 @@
       <w:color w:val="60a0b0"/>
     </w:rPr>
   </w:style>
-  <w:style w:type="character" w:customStyle="1" w:styleId="AlertTok">
+  <w:style w:customStyle="1" w:styleId="AlertTok" w:type="character">
     <w:name w:val="AlertTok"/>
     <w:basedOn w:val="VerbatimChar"/>
     <w:rPr>
@@ -2021,7 +2506,7 @@
       <w:color w:val="ff0000"/>
     </w:rPr>
   </w:style>
-  <w:style w:type="character" w:customStyle="1" w:styleId="ErrorTok">
+  <w:style w:customStyle="1" w:styleId="ErrorTok" w:type="character">
     <w:name w:val="ErrorTok"/>
     <w:basedOn w:val="VerbatimChar"/>
     <w:rPr>
@@ -2029,7 +2514,7 @@
       <w:color w:val="ff0000"/>
     </w:rPr>
   </w:style>
-  <w:style w:type="character" w:customStyle="1" w:styleId="NormalTok">
+  <w:style w:customStyle="1" w:styleId="NormalTok" w:type="character">
     <w:name w:val="NormalTok"/>
     <w:basedOn w:val="VerbatimChar"/>
     <w:rPr/>

</xml_diff>

<commit_message>
MC 451 codebook template: list looked-up fields, matching MC 501
Co-Authored-By: Claude Opus 5.5 <noreply@anthropic.com>
</commit_message>
<xml_diff>
--- a/resources/templates/MC451-codebook-template.docx
+++ b/resources/templates/MC451-codebook-template.docx
@@ -76,6 +76,18 @@
           <w:iCs/>
         </w:rPr>
         <w:t xml:space="preserve">State exactly what one coded item is (one message, one post, one minute of video), and say what is not part of it (replies, links, images). State it once. Every variable below is coded on this item.</w:t>
+      </w:r>
+    </w:p>
+    <w:p>
+      <w:pPr>
+        <w:pStyle w:val="BodyText"/>
+      </w:pPr>
+      <w:r>
+        <w:rPr>
+          <w:i/>
+          <w:iCs/>
+        </w:rPr>
+        <w:t xml:space="preserve">List any fields you look up rather than code (an ID, a date, a count), and any measure you compute in R from your coded variables.</w:t>
       </w:r>
     </w:p>
     <w:bookmarkEnd w:id="10"/>

</xml_diff>